<commit_message>
Un generateur de demonstration par module ; typographie epargne le code
</commit_message>
<xml_diff>
--- a/documents/Memento_Clean_Code.docx
+++ b/documents/Memento_Clean_Code.docx
@@ -4979,7 +4979,7 @@
           <w:sz w:val="18"/>
           <w:szCs w:val="18"/>
         </w:rPr>
-        <w:t xml:space="preserve">// la boucle ne change pas : le 0 et le i++ sont la mecanique du parcours</w:t>
+        <w:t xml:space="preserve">// la boucle ne change pas : le 0 et le i++ sont la mecanique du parcours</w:t>
       </w:r>
     </w:p>
     <w:p>
@@ -5054,7 +5054,7 @@
           <w:sz w:val="18"/>
           <w:szCs w:val="18"/>
         </w:rPr>
-        <w:t xml:space="preserve">// seul le 4 disparait : lui seul encodait une decision</w:t>
+        <w:t xml:space="preserve">// seul le 4 disparait : lui seul encodait une decision</w:t>
       </w:r>
     </w:p>
     <w:p>
@@ -5204,7 +5204,7 @@
           <w:sz w:val="18"/>
           <w:szCs w:val="18"/>
         </w:rPr>
-        <w:t xml:space="preserve">if (autre.getRole().equals("ADMLN")) { ... }      // qui verra la faute ?</w:t>
+        <w:t xml:space="preserve">if (autre.getRole().equals("ADMLN")) { ... }      // qui verra la faute ?</w:t>
       </w:r>
     </w:p>
     <w:p>
@@ -5615,7 +5615,7 @@
           <w:sz w:val="18"/>
           <w:szCs w:val="18"/>
         </w:rPr>
-        <w:t xml:space="preserve">    for (Joueur joueur : joueurs) {</w:t>
+        <w:t xml:space="preserve">    for (Joueur joueur : joueurs) {</w:t>
       </w:r>
     </w:p>
     <w:p>
@@ -5878,7 +5878,7 @@
           <w:sz w:val="18"/>
           <w:szCs w:val="18"/>
         </w:rPr>
-        <w:t xml:space="preserve">date = addToDate(date, 3);      // trois quoi ? jours ? mois ?</w:t>
+        <w:t xml:space="preserve">date = addToDate(date, 3);      // trois quoi ? jours ? mois ?</w:t>
       </w:r>
     </w:p>
     <w:p>
@@ -6181,7 +6181,7 @@
           <w:sz w:val="18"/>
           <w:szCs w:val="18"/>
         </w:rPr>
-        <w:t xml:space="preserve">        for (String element : liste) {</w:t>
+        <w:t xml:space="preserve">        for (String element : liste) {</w:t>
       </w:r>
     </w:p>
     <w:p>
@@ -6438,7 +6438,7 @@
           <w:sz w:val="18"/>
           <w:szCs w:val="18"/>
         </w:rPr>
-        <w:t xml:space="preserve">    for (String element : liste) {</w:t>
+        <w:t xml:space="preserve">    for (String element : liste) {</w:t>
       </w:r>
     </w:p>
     <w:p>
@@ -6618,7 +6618,7 @@
           <w:sz w:val="18"/>
           <w:szCs w:val="18"/>
         </w:rPr>
-        <w:t xml:space="preserve">    for (Client client : clients) {</w:t>
+        <w:t xml:space="preserve">    for (Client client : clients) {</w:t>
       </w:r>
     </w:p>
     <w:p>
@@ -6755,7 +6755,7 @@
           <w:sz w:val="18"/>
           <w:szCs w:val="18"/>
         </w:rPr>
-        <w:t xml:space="preserve">    for (Client client : clients) {</w:t>
+        <w:t xml:space="preserve">    for (Client client : clients) {</w:t>
       </w:r>
     </w:p>
     <w:p>
@@ -8879,7 +8879,7 @@
           <w:sz w:val="18"/>
           <w:szCs w:val="18"/>
         </w:rPr>
-        <w:t xml:space="preserve">// L'arrondi se fait a 2 decimales : impose par la reglementation</w:t>
+        <w:t xml:space="preserve">// L'arrondi se fait a 2 decimales : impose par la reglementation</w:t>
       </w:r>
     </w:p>
     <w:p>
@@ -9797,7 +9797,7 @@
           <w:sz w:val="18"/>
           <w:szCs w:val="18"/>
         </w:rPr>
-        <w:t xml:space="preserve">// n'importe qui peut vider la partie de ses joueurs :</w:t>
+        <w:t xml:space="preserve">// n'importe qui peut vider la partie de ses joueurs :</w:t>
       </w:r>
     </w:p>
     <w:p>
@@ -10252,7 +10252,7 @@
           <w:sz w:val="18"/>
           <w:szCs w:val="18"/>
         </w:rPr>
-        <w:t xml:space="preserve">// chez l'appelant, rien n'oblige a ecrire ceci :</w:t>
+        <w:t xml:space="preserve">// chez l'appelant, rien n'oblige a ecrire ceci :</w:t>
       </w:r>
     </w:p>
     <w:p>
@@ -10267,7 +10267,7 @@
           <w:sz w:val="18"/>
           <w:szCs w:val="18"/>
         </w:rPr>
-        <w:t xml:space="preserve">compte.retirer(500);   // et si le retrait a echoue ?</w:t>
+        <w:t xml:space="preserve">compte.retirer(500);   // et si le retrait a echoue ?</w:t>
       </w:r>
     </w:p>
     <w:p>
@@ -10344,7 +10344,7 @@
           <w:sz w:val="18"/>
           <w:szCs w:val="18"/>
         </w:rPr>
-        <w:t xml:space="preserve">                "Retrait de " + montant + " refuse : solde de " + solde);</w:t>
+        <w:t xml:space="preserve">                "Retrait de " + montant + " refuse : solde de " + solde);</w:t>
       </w:r>
     </w:p>
     <w:p>
@@ -10419,7 +10419,7 @@
           <w:sz w:val="18"/>
           <w:szCs w:val="18"/>
         </w:rPr>
-        <w:t xml:space="preserve">// chez l'appelant, l'echec ne peut plus passer inapercu :</w:t>
+        <w:t xml:space="preserve">// chez l'appelant, l'echec ne peut plus passer inapercu :</w:t>
       </w:r>
     </w:p>
     <w:p>
@@ -10630,7 +10630,7 @@
           <w:sz w:val="18"/>
           <w:szCs w:val="18"/>
         </w:rPr>
-        <w:t xml:space="preserve">    for (Joueur joueur : joueurs) {</w:t>
+        <w:t xml:space="preserve">    for (Joueur joueur : joueurs) {</w:t>
       </w:r>
     </w:p>
     <w:p>
@@ -10767,7 +10767,7 @@
           <w:sz w:val="18"/>
           <w:szCs w:val="18"/>
         </w:rPr>
-        <w:t xml:space="preserve">    for (Joueur joueur : joueurs) {</w:t>
+        <w:t xml:space="preserve">    for (Joueur joueur : joueurs) {</w:t>
       </w:r>
     </w:p>
     <w:p>
@@ -10933,22 +10933,22 @@
           <w:sz w:val="18"/>
           <w:szCs w:val="18"/>
         </w:rPr>
-        <w:t xml:space="preserve">if (partie.getJoueurs() != null) {</w:t>
-      </w:r>
-    </w:p>
-    <w:p>
-      <w:pPr>
-        <w:shd w:fill="FBEDED" w:val="clear"/>
-        <w:spacing w:after="0"/>
-        <w:ind w:left="220"/>
-      </w:pPr>
-      <w:r>
-        <w:rPr>
-          <w:rFonts w:ascii="Consolas" w:cs="Consolas" w:eastAsia="Consolas" w:hAnsi="Consolas"/>
-          <w:sz w:val="18"/>
-          <w:szCs w:val="18"/>
-        </w:rPr>
-        <w:t xml:space="preserve">    for (Joueur joueur : partie.getJoueurs()) { ... }</w:t>
+        <w:t xml:space="preserve">if (partie.getJoueurs() != null) {</w:t>
+      </w:r>
+    </w:p>
+    <w:p>
+      <w:pPr>
+        <w:shd w:fill="FBEDED" w:val="clear"/>
+        <w:spacing w:after="0"/>
+        <w:ind w:left="220"/>
+      </w:pPr>
+      <w:r>
+        <w:rPr>
+          <w:rFonts w:ascii="Consolas" w:cs="Consolas" w:eastAsia="Consolas" w:hAnsi="Consolas"/>
+          <w:sz w:val="18"/>
+          <w:szCs w:val="18"/>
+        </w:rPr>
+        <w:t xml:space="preserve">    for (Joueur joueur : partie.getJoueurs()) { ... }</w:t>
       </w:r>
     </w:p>
     <w:p>
@@ -10995,7 +10995,7 @@
           <w:sz w:val="18"/>
           <w:szCs w:val="18"/>
         </w:rPr>
-        <w:t xml:space="preserve">for (Joueur joueur : partie.getJoueurs()) { ... }</w:t>
+        <w:t xml:space="preserve">for (Joueur joueur : partie.getJoueurs()) { ... }</w:t>
       </w:r>
     </w:p>
     <w:p>
@@ -11465,7 +11465,7 @@
           <w:sz w:val="18"/>
           <w:szCs w:val="18"/>
         </w:rPr>
-        <w:t xml:space="preserve">        "Nombre de cartes invalide : " + nombre + " (attendu entre 1 et 52)");</w:t>
+        <w:t xml:space="preserve">        "Nombre de cartes invalide : " + nombre + " (attendu entre 1 et 52)");</w:t>
       </w:r>
     </w:p>
     <w:p>

</xml_diff>

<commit_message>
Nouvelle règle CC pour assertions, reformulation ITF, reformulation 'module' au lieu de 'séance' sur README
</commit_message>
<xml_diff>
--- a/documents/Memento_Clean_Code.docx
+++ b/documents/Memento_Clean_Code.docx
@@ -46,7 +46,7 @@
           <w:sz w:val="36"/>
           <w:szCs w:val="36"/>
         </w:rPr>
-        <w:t xml:space="preserve">36 règles pour écrire du code qu'on peut relire</w:t>
+        <w:t xml:space="preserve">37 règles pour écrire du code qu'on peut relire</w:t>
       </w:r>
     </w:p>
     <w:p>
@@ -2358,6 +2358,61 @@
           </w:p>
         </w:tc>
       </w:tr>
+      <w:tr>
+        <w:tc>
+          <w:tcPr>
+            <w:tcW w:type="dxa" w:w="1700"/>
+            <w:tcMar>
+              <w:top w:type="dxa" w:w="50"/>
+              <w:left w:type="dxa" w:w="100"/>
+              <w:bottom w:type="dxa" w:w="50"/>
+              <w:right w:type="dxa" w:w="100"/>
+            </w:tcMar>
+          </w:tcPr>
+          <w:p>
+            <w:pPr>
+              <w:spacing w:after="0"/>
+            </w:pPr>
+            <w:hyperlink w:history="1" w:anchor="CC_TST_4">
+              <w:r>
+                <w:rPr>
+                  <w:rFonts w:ascii="Consolas" w:hAnsi="Consolas" w:cs="Consolas"/>
+                  <w:color w:val="0563C1"/>
+                  <w:sz w:val="18"/>
+                  <w:szCs w:val="18"/>
+                  <w:u w:val="single"/>
+                </w:rPr>
+                <w:t xml:space="preserve">CC-TST.4</w:t>
+              </w:r>
+            </w:hyperlink>
+          </w:p>
+        </w:tc>
+        <w:tc>
+          <w:tcPr>
+            <w:tcW w:type="dxa" w:w="7660"/>
+            <w:tcMar>
+              <w:top w:type="dxa" w:w="50"/>
+              <w:left w:type="dxa" w:w="100"/>
+              <w:bottom w:type="dxa" w:w="50"/>
+              <w:right w:type="dxa" w:w="100"/>
+            </w:tcMar>
+          </w:tcPr>
+          <w:p>
+            <w:pPr>
+              <w:spacing w:after="0"/>
+            </w:pPr>
+            <w:hyperlink w:history="1" w:anchor="CC_TST_4">
+              <w:r>
+                <w:rPr>
+                  <w:sz w:val="20"/>
+                  <w:szCs w:val="20"/>
+                </w:rPr>
+                <w:t xml:space="preserve">Un test se termine par une assertion</w:t>
+              </w:r>
+            </w:hyperlink>
+          </w:p>
+        </w:tc>
+      </w:tr>
     </w:tbl>
     <w:p>
       <w:pPr>
@@ -15824,6 +15879,382 @@
       </w:r>
     </w:p>
     <w:p>
+      <w:pPr>
+        <w:pStyle w:val="Heading2"/>
+        <w:spacing w:after="120" w:before="300"/>
+      </w:pPr>
+      <w:bookmarkStart w:name="CC_TST_4" w:id="1"/>
+      <w:r>
+        <w:rPr>
+          <w:rFonts w:ascii="Consolas" w:hAnsi="Consolas" w:cs="Consolas"/>
+          <w:b/>
+          <w:bCs/>
+          <w:color w:val="E97132" w:themeColor="accent2"/>
+          <w:sz w:val="25"/>
+          <w:szCs w:val="25"/>
+          <w:u w:val="none"/>
+        </w:rPr>
+        <w:t xml:space="preserve">CC-TST.4</w:t>
+      </w:r>
+      <w:r>
+        <w:rPr>
+          <w:b/>
+          <w:bCs/>
+          <w:color w:val="1F4E79"/>
+          <w:sz w:val="25"/>
+          <w:szCs w:val="25"/>
+        </w:rPr>
+        <w:t xml:space="preserve"> — Un test se termine par une assertion</w:t>
+      </w:r>
+      <w:bookmarkEnd w:id="1"/>
+    </w:p>
+    <w:p>
+      <w:pPr>
+        <w:spacing w:after="120"/>
+      </w:pPr>
+      <w:r>
+        <w:rPr>
+          <w:sz w:val="22"/>
+          <w:szCs w:val="22"/>
+        </w:rPr>
+        <w:t xml:space="preserve">Sans assertion, un test appelle du code et ne vérifie rien : il passe au vert quoi qu'il arrive, sauf si une exception l'interrompt. Il donne l'illusion d'une vérification, ce qui est pire que pas de test du tout. C'est aussi le défaut le plus fréquent dans les copies d'examen.</w:t>
+      </w:r>
+    </w:p>
+    <w:p>
+      <w:pPr>
+        <w:shd w:fill="FBEDED" w:val="clear"/>
+        <w:spacing w:after="0" w:before="140"/>
+        <w:ind w:left="220"/>
+      </w:pPr>
+      <w:r>
+        <w:rPr>
+          <w:b/>
+          <w:bCs/>
+          <w:color w:val="9C2B2B"/>
+          <w:sz w:val="18"/>
+          <w:szCs w:val="18"/>
+        </w:rPr>
+        <w:t xml:space="preserve">À ÉVITER</w:t>
+      </w:r>
+    </w:p>
+    <w:p>
+      <w:pPr>
+        <w:shd w:fill="FBEDED" w:val="clear"/>
+        <w:spacing w:after="0"/>
+        <w:ind w:left="220"/>
+      </w:pPr>
+      <w:r>
+        <w:rPr>
+          <w:rFonts w:ascii="Consolas" w:hAnsi="Consolas" w:cs="Consolas"/>
+          <w:color w:val="E97132" w:themeColor="accent2"/>
+          <w:sz w:val="18"/>
+          <w:szCs w:val="18"/>
+        </w:rPr>
+        <w:t xml:space="preserve">@Test</w:t>
+      </w:r>
+    </w:p>
+    <w:p>
+      <w:pPr>
+        <w:shd w:fill="FBEDED" w:val="clear"/>
+        <w:spacing w:after="0"/>
+        <w:ind w:left="220"/>
+      </w:pPr>
+      <w:r>
+        <w:rPr>
+          <w:rFonts w:ascii="Consolas" w:hAnsi="Consolas" w:cs="Consolas"/>
+          <w:color w:val="E97132" w:themeColor="accent2"/>
+          <w:sz w:val="18"/>
+          <w:szCs w:val="18"/>
+        </w:rPr>
+        <w:t xml:space="preserve">void reserverDeuxPlaces() throws SalleCompleteException {</w:t>
+      </w:r>
+    </w:p>
+    <w:p>
+      <w:pPr>
+        <w:shd w:fill="FBEDED" w:val="clear"/>
+        <w:spacing w:after="0"/>
+        <w:ind w:left="220"/>
+      </w:pPr>
+      <w:r>
+        <w:rPr>
+          <w:rFonts w:ascii="Consolas" w:hAnsi="Consolas" w:cs="Consolas"/>
+          <w:color w:val="E97132" w:themeColor="accent2"/>
+          <w:sz w:val="18"/>
+          <w:szCs w:val="18"/>
+        </w:rPr>
+        <w:t xml:space="preserve">    Salle salle = new Salle(100);</w:t>
+      </w:r>
+    </w:p>
+    <w:p>
+      <w:pPr>
+        <w:shd w:fill="FBEDED" w:val="clear"/>
+        <w:spacing w:after="0"/>
+        <w:ind w:left="220"/>
+      </w:pPr>
+      <w:r>
+        <w:rPr>
+          <w:rFonts w:ascii="Consolas" w:hAnsi="Consolas" w:cs="Consolas"/>
+          <w:color w:val="E97132" w:themeColor="accent2"/>
+          <w:sz w:val="18"/>
+          <w:szCs w:val="18"/>
+        </w:rPr>
+        <w:t xml:space="preserve"> </w:t>
+      </w:r>
+    </w:p>
+    <w:p>
+      <w:pPr>
+        <w:shd w:fill="FBEDED" w:val="clear"/>
+        <w:spacing w:after="0"/>
+        <w:ind w:left="220"/>
+      </w:pPr>
+      <w:r>
+        <w:rPr>
+          <w:rFonts w:ascii="Consolas" w:hAnsi="Consolas" w:cs="Consolas"/>
+          <w:color w:val="E97132" w:themeColor="accent2"/>
+          <w:sz w:val="18"/>
+          <w:szCs w:val="18"/>
+        </w:rPr>
+        <w:t xml:space="preserve">    salle.reserver(2);</w:t>
+      </w:r>
+    </w:p>
+    <w:p>
+      <w:pPr>
+        <w:shd w:fill="FBEDED" w:val="clear"/>
+        <w:spacing w:after="0"/>
+        <w:ind w:left="220"/>
+      </w:pPr>
+      <w:r>
+        <w:rPr>
+          <w:rFonts w:ascii="Consolas" w:hAnsi="Consolas" w:cs="Consolas"/>
+          <w:color w:val="E97132" w:themeColor="accent2"/>
+          <w:sz w:val="18"/>
+          <w:szCs w:val="18"/>
+        </w:rPr>
+        <w:t xml:space="preserve"> </w:t>
+      </w:r>
+    </w:p>
+    <w:p>
+      <w:pPr>
+        <w:shd w:fill="FBEDED" w:val="clear"/>
+        <w:spacing w:after="0"/>
+        <w:ind w:left="220"/>
+      </w:pPr>
+      <w:r>
+        <w:rPr>
+          <w:rFonts w:ascii="Consolas" w:hAnsi="Consolas" w:cs="Consolas"/>
+          <w:color w:val="E97132" w:themeColor="accent2"/>
+          <w:sz w:val="18"/>
+          <w:szCs w:val="18"/>
+        </w:rPr>
+        <w:t xml:space="preserve">    System.out.println(salle.placesLibres());   // affiche, ne verifie rien</w:t>
+      </w:r>
+    </w:p>
+    <w:p>
+      <w:pPr>
+        <w:shd w:fill="FBEDED" w:val="clear"/>
+        <w:spacing w:after="140"/>
+        <w:ind w:left="220"/>
+      </w:pPr>
+      <w:r>
+        <w:rPr>
+          <w:rFonts w:ascii="Consolas" w:hAnsi="Consolas" w:cs="Consolas"/>
+          <w:color w:val="E97132" w:themeColor="accent2"/>
+          <w:sz w:val="18"/>
+          <w:szCs w:val="18"/>
+        </w:rPr>
+        <w:t xml:space="preserve">}</w:t>
+      </w:r>
+    </w:p>
+    <w:p>
+      <w:pPr>
+        <w:shd w:fill="EDF5ED" w:val="clear"/>
+        <w:spacing w:after="0" w:before="140"/>
+        <w:ind w:left="220"/>
+      </w:pPr>
+      <w:r>
+        <w:rPr>
+          <w:b/>
+          <w:bCs/>
+          <w:color w:val="2E6B34"/>
+          <w:sz w:val="18"/>
+          <w:szCs w:val="18"/>
+        </w:rPr>
+        <w:t xml:space="preserve">PRÉFÉREZ</w:t>
+      </w:r>
+    </w:p>
+    <w:p>
+      <w:pPr>
+        <w:shd w:fill="EDF5ED" w:val="clear"/>
+        <w:spacing w:after="0"/>
+        <w:ind w:left="220"/>
+      </w:pPr>
+      <w:r>
+        <w:rPr>
+          <w:rFonts w:ascii="Consolas" w:hAnsi="Consolas" w:cs="Consolas"/>
+          <w:color w:val="E97132" w:themeColor="accent2"/>
+          <w:sz w:val="18"/>
+          <w:szCs w:val="18"/>
+        </w:rPr>
+        <w:t xml:space="preserve">@Test</w:t>
+      </w:r>
+    </w:p>
+    <w:p>
+      <w:pPr>
+        <w:shd w:fill="EDF5ED" w:val="clear"/>
+        <w:spacing w:after="0"/>
+        <w:ind w:left="220"/>
+      </w:pPr>
+      <w:r>
+        <w:rPr>
+          <w:rFonts w:ascii="Consolas" w:hAnsi="Consolas" w:cs="Consolas"/>
+          <w:color w:val="E97132" w:themeColor="accent2"/>
+          <w:sz w:val="18"/>
+          <w:szCs w:val="18"/>
+        </w:rPr>
+        <w:t xml:space="preserve">void reserverDeuxPlaces() throws SalleCompleteException {</w:t>
+      </w:r>
+    </w:p>
+    <w:p>
+      <w:pPr>
+        <w:shd w:fill="EDF5ED" w:val="clear"/>
+        <w:spacing w:after="0"/>
+        <w:ind w:left="220"/>
+      </w:pPr>
+      <w:r>
+        <w:rPr>
+          <w:rFonts w:ascii="Consolas" w:hAnsi="Consolas" w:cs="Consolas"/>
+          <w:color w:val="E97132" w:themeColor="accent2"/>
+          <w:sz w:val="18"/>
+          <w:szCs w:val="18"/>
+        </w:rPr>
+        <w:t xml:space="preserve">    Salle salle = new Salle(100);</w:t>
+      </w:r>
+    </w:p>
+    <w:p>
+      <w:pPr>
+        <w:shd w:fill="EDF5ED" w:val="clear"/>
+        <w:spacing w:after="0"/>
+        <w:ind w:left="220"/>
+      </w:pPr>
+      <w:r>
+        <w:rPr>
+          <w:rFonts w:ascii="Consolas" w:hAnsi="Consolas" w:cs="Consolas"/>
+          <w:color w:val="E97132" w:themeColor="accent2"/>
+          <w:sz w:val="18"/>
+          <w:szCs w:val="18"/>
+        </w:rPr>
+        <w:t xml:space="preserve"> </w:t>
+      </w:r>
+    </w:p>
+    <w:p>
+      <w:pPr>
+        <w:shd w:fill="EDF5ED" w:val="clear"/>
+        <w:spacing w:after="0"/>
+        <w:ind w:left="220"/>
+      </w:pPr>
+      <w:r>
+        <w:rPr>
+          <w:rFonts w:ascii="Consolas" w:hAnsi="Consolas" w:cs="Consolas"/>
+          <w:color w:val="E97132" w:themeColor="accent2"/>
+          <w:sz w:val="18"/>
+          <w:szCs w:val="18"/>
+        </w:rPr>
+        <w:t xml:space="preserve">    salle.reserver(2);</w:t>
+      </w:r>
+    </w:p>
+    <w:p>
+      <w:pPr>
+        <w:shd w:fill="EDF5ED" w:val="clear"/>
+        <w:spacing w:after="0"/>
+        <w:ind w:left="220"/>
+      </w:pPr>
+      <w:r>
+        <w:rPr>
+          <w:rFonts w:ascii="Consolas" w:hAnsi="Consolas" w:cs="Consolas"/>
+          <w:color w:val="E97132" w:themeColor="accent2"/>
+          <w:sz w:val="18"/>
+          <w:szCs w:val="18"/>
+        </w:rPr>
+        <w:t xml:space="preserve"> </w:t>
+      </w:r>
+    </w:p>
+    <w:p>
+      <w:pPr>
+        <w:shd w:fill="EDF5ED" w:val="clear"/>
+        <w:spacing w:after="0"/>
+        <w:ind w:left="220"/>
+      </w:pPr>
+      <w:r>
+        <w:rPr>
+          <w:rFonts w:ascii="Consolas" w:hAnsi="Consolas" w:cs="Consolas"/>
+          <w:color w:val="E97132" w:themeColor="accent2"/>
+          <w:sz w:val="18"/>
+          <w:szCs w:val="18"/>
+        </w:rPr>
+        <w:t xml:space="preserve">    assertEquals(98, salle.placesLibres(),</w:t>
+      </w:r>
+    </w:p>
+    <w:p>
+      <w:pPr>
+        <w:shd w:fill="EDF5ED" w:val="clear"/>
+        <w:spacing w:after="0"/>
+        <w:ind w:left="220"/>
+      </w:pPr>
+      <w:r>
+        <w:rPr>
+          <w:rFonts w:ascii="Consolas" w:hAnsi="Consolas" w:cs="Consolas"/>
+          <w:color w:val="E97132" w:themeColor="accent2"/>
+          <w:sz w:val="18"/>
+          <w:szCs w:val="18"/>
+        </w:rPr>
+        <w:t xml:space="preserve">            "Deux places reservees sur 100 doivent en laisser 98");</w:t>
+      </w:r>
+    </w:p>
+    <w:p>
+      <w:pPr>
+        <w:shd w:fill="EDF5ED" w:val="clear"/>
+        <w:spacing w:after="140"/>
+        <w:ind w:left="220"/>
+      </w:pPr>
+      <w:r>
+        <w:rPr>
+          <w:rFonts w:ascii="Consolas" w:hAnsi="Consolas" w:cs="Consolas"/>
+          <w:color w:val="E97132" w:themeColor="accent2"/>
+          <w:sz w:val="18"/>
+          <w:szCs w:val="18"/>
+        </w:rPr>
+        <w:t xml:space="preserve">}</w:t>
+      </w:r>
+    </w:p>
+    <w:p>
+      <w:pPr>
+        <w:spacing w:after="120"/>
+      </w:pPr>
+      <w:r>
+        <w:rPr>
+          <w:sz w:val="22"/>
+          <w:szCs w:val="22"/>
+        </w:rPr>
+        <w:t xml:space="preserve">Un test qui vérifie qu'une exception est levée a lui aussi son assertion : </w:t>
+      </w:r>
+      <w:r>
+        <w:rPr>
+          <w:rFonts w:ascii="Consolas" w:hAnsi="Consolas" w:cs="Consolas"/>
+          <w:color w:val="E97132" w:themeColor="accent2"/>
+          <w:sz w:val="18"/>
+          <w:szCs w:val="18"/>
+        </w:rPr>
+        <w:t xml:space="preserve">assertThrows</w:t>
+      </w:r>
+      <w:r>
+        <w:rPr>
+          <w:sz w:val="22"/>
+          <w:szCs w:val="22"/>
+        </w:rPr>
+        <w:t xml:space="preserve">. Pour vous assurer qu'un test peut échouer, faites-le échouer une fois : changez l'attendu, et regardez-le passer au rouge. Un test qu'on n'a jamais vu rouge ne prouve rien.</w:t>
+      </w:r>
+    </w:p>
+    <w:p>
       <w:r>
         <w:br w:type="page"/>
       </w:r>
@@ -18039,7 +18470,7 @@
         </w:rPr>
         <w:t xml:space="preserve">En français, Julien Lucas présente ces principes dans une vidéo : </w:t>
       </w:r>
-      <w:hyperlink w:history="1" r:id="rIdorsmlwzclots5ia9cwmrq">
+      <w:hyperlink w:history="1" r:id="rIdol87cjbqoeqjzx-vrzb4k">
         <w:r>
           <w:rPr>
             <w:color w:val="0563C1"/>

</xml_diff>